<commit_message>
Close the paren in the PREVIOUS EXPERIENCE heading (drop one underscore)
The v8 template lost the closing ')' after "...Team Lead". Restore it and remove one
trailing underscore so the heading line doesn't wrap. Build verified against cv_218.

Co-Authored-By: Claude Opus 4.8 <noreply@anthropic.com>
</commit_message>
<xml_diff>
--- a/config/cv_template.docx
+++ b/config/cv_template.docx
@@ -2218,7 +2218,7 @@
           <w:szCs w:val="20"/>
           <w:rtl w:val="0"/>
         </w:rPr>
-        <w:t xml:space="preserve">PREVIOUS EXPERIENCE (Civil Engineer - Construction Site Team Lead</w:t>
+        <w:t xml:space="preserve">PREVIOUS EXPERIENCE (Civil Engineer - Construction Site Team Lead)</w:t>
       </w:r>
       <w:r>
         <w:rPr>
@@ -2228,7 +2228,7 @@
           <w:szCs w:val="20"/>
           <w:rtl w:val="0"/>
         </w:rPr>
-        <w:t xml:space="preserve">__________________________________________________</w:t>
+        <w:t xml:space="preserve">_________________________________________________</w:t>
       </w:r>
       <w:r>
         <w:rPr>

</xml_diff>